<commit_message>
Remove conference and co-author mentions; update resume
</commit_message>
<xml_diff>
--- a/public/Kavya_Kalavala_Resume.docx
+++ b/public/Kavya_Kalavala_Resume.docx
@@ -74,7 +74,7 @@
           <w:sz w:val="20"/>
           <w:szCs w:val="20"/>
         </w:rPr>
-        <w:t xml:space="preserve">Computer Science (Data Science) undergraduate building machine-learning systems in graph and temporal learning, generative models, EEG and biomedical AI, security ML, and agentic LLM applications. Focused on leakage-controlled evaluation, uncertainty quantification and reproducible research; first-author paper presented at CIMA 2026.</w:t>
+        <w:t xml:space="preserve">Computer Science (Data Science) undergraduate building machine-learning systems in graph and temporal learning, generative models, EEG and biomedical AI, security ML, and agentic LLM applications. Focused on leakage-controlled evaluation, uncertainty quantification and reproducible research.</w:t>
       </w:r>
     </w:p>
     <w:p>
@@ -624,7 +624,7 @@
           <w:sz w:val="22"/>
           <w:szCs w:val="22"/>
         </w:rPr>
-        <w:t xml:space="preserve">PUBLICATIONS</w:t>
+        <w:t xml:space="preserve">RESEARCH MANUSCRIPTS</w:t>
       </w:r>
     </w:p>
     <w:p>
@@ -642,7 +642,7 @@
           <w:sz w:val="20"/>
           <w:szCs w:val="20"/>
         </w:rPr>
-        <w:t xml:space="preserve">K. Kalavala, Mahadevi S, "Contextualization-Aware Adapter Placement for Sampling-Rate Transfer in Wearable Machine Learning," presented at CIMA 2026.</w:t>
+        <w:t xml:space="preserve">Contextualization-Aware Adapter Placement for Sampling-Rate Transfer in Wearable Machine Learning (manuscript).</w:t>
       </w:r>
     </w:p>
     <w:p>
@@ -660,7 +660,7 @@
           <w:sz w:val="20"/>
           <w:szCs w:val="20"/>
         </w:rPr>
-        <w:t xml:space="preserve">Manuscripts in preparation with Mahadevi S: Curvature-Audited Boltzmann Evidence for Source Localization in Evolving Networks; Shot-Adaptive Quantum Expert Routing with Certified Top-Ten Decisions.</w:t>
+        <w:t xml:space="preserve">Curvature-Audited Boltzmann Evidence for Source Localization in Evolving Networks; Shot-Adaptive Quantum Expert Routing with Certified Top-Ten Decisions (manuscripts in preparation).</w:t>
       </w:r>
     </w:p>
     <w:p>

</xml_diff>

<commit_message>
Light mode: full colour coverage; add PalletCast and MOGA-FCM publication; updated resume
</commit_message>
<xml_diff>
--- a/public/Kavya_Kalavala_Resume.docx
+++ b/public/Kavya_Kalavala_Resume.docx
@@ -34,7 +34,7 @@
     </w:p>
     <w:p>
       <w:pPr>
-        <w:spacing w:after="60"/>
+        <w:spacing w:after="50"/>
         <w:jc w:val="center"/>
       </w:pPr>
       <w:r>
@@ -51,7 +51,7 @@
         <w:pBdr>
           <w:bottom w:val="single" w:color="000000" w:sz="6" w:space="1"/>
         </w:pBdr>
-        <w:spacing w:after="50" w:before="120"/>
+        <w:spacing w:after="45" w:before="110"/>
       </w:pPr>
       <w:r>
         <w:rPr>
@@ -66,15 +66,15 @@
     </w:p>
     <w:p>
       <w:pPr>
-        <w:spacing w:after="20"/>
-      </w:pPr>
-      <w:r>
-        <w:rPr>
-          <w:rFonts w:ascii="Calibri" w:cs="Calibri" w:eastAsia="Calibri" w:hAnsi="Calibri"/>
-          <w:sz w:val="20"/>
-          <w:szCs w:val="20"/>
-        </w:rPr>
-        <w:t xml:space="preserve">Computer Science (Data Science) undergraduate building machine-learning systems in graph and temporal learning, generative models, EEG and biomedical AI, security ML, and agentic LLM applications. Focused on leakage-controlled evaluation, uncertainty quantification and reproducible research.</w:t>
+        <w:spacing w:after="15"/>
+      </w:pPr>
+      <w:r>
+        <w:rPr>
+          <w:rFonts w:ascii="Calibri" w:cs="Calibri" w:eastAsia="Calibri" w:hAnsi="Calibri"/>
+          <w:sz w:val="20"/>
+          <w:szCs w:val="20"/>
+        </w:rPr>
+        <w:t xml:space="preserve">Computer Science (Data Science) undergraduate building machine-learning systems in forecasting and MLOps, graph and temporal learning, generative models, EEG and biomedical AI, security ML, and agentic LLM applications. Focused on leakage-controlled evaluation, uncertainty quantification and reproducible research.</w:t>
       </w:r>
     </w:p>
     <w:p>
@@ -82,7 +82,7 @@
         <w:pBdr>
           <w:bottom w:val="single" w:color="000000" w:sz="6" w:space="1"/>
         </w:pBdr>
-        <w:spacing w:after="50" w:before="120"/>
+        <w:spacing w:after="45" w:before="110"/>
       </w:pPr>
       <w:r>
         <w:rPr>
@@ -97,7 +97,7 @@
     </w:p>
     <w:p>
       <w:pPr>
-        <w:spacing w:after="20"/>
+        <w:spacing w:after="15"/>
       </w:pPr>
       <w:r>
         <w:rPr>
@@ -120,7 +120,7 @@
     </w:p>
     <w:p>
       <w:pPr>
-        <w:spacing w:after="20"/>
+        <w:spacing w:after="15"/>
       </w:pPr>
       <w:r>
         <w:rPr>
@@ -138,12 +138,35 @@
           <w:sz w:val="20"/>
           <w:szCs w:val="20"/>
         </w:rPr>
-        <w:t xml:space="preserve">PyTorch, TensorFlow/Keras, scikit-learn, XGBoost, PyTorch Geometric, graph neural networks, attention models, diffusion models, time-series forecasting, Riemannian (SPD) methods</w:t>
-      </w:r>
-    </w:p>
-    <w:p>
-      <w:pPr>
-        <w:spacing w:after="20"/>
+        <w:t xml:space="preserve">PyTorch, scikit-learn, XGBoost, LightGBM, PyTorch Geometric, graph neural networks, diffusion models, time-series forecasting, Riemannian (SPD) methods</w:t>
+      </w:r>
+    </w:p>
+    <w:p>
+      <w:pPr>
+        <w:spacing w:after="15"/>
+      </w:pPr>
+      <w:r>
+        <w:rPr>
+          <w:rFonts w:ascii="Calibri" w:cs="Calibri" w:eastAsia="Calibri" w:hAnsi="Calibri"/>
+          <w:b/>
+          <w:bCs/>
+          <w:sz w:val="20"/>
+          <w:szCs w:val="20"/>
+        </w:rPr>
+        <w:t xml:space="preserve">MLOps and Engineering: </w:t>
+      </w:r>
+      <w:r>
+        <w:rPr>
+          <w:rFonts w:ascii="Calibri" w:cs="Calibri" w:eastAsia="Calibri" w:hAnsi="Calibri"/>
+          <w:sz w:val="20"/>
+          <w:szCs w:val="20"/>
+        </w:rPr>
+        <w:t xml:space="preserve">MLflow, DVC, Prefect, Evidently, FastAPI, Docker, GitHub Actions, PostgreSQL, Azure AI Search, Linux</w:t>
+      </w:r>
+    </w:p>
+    <w:p>
+      <w:pPr>
+        <w:spacing w:after="15"/>
       </w:pPr>
       <w:r>
         <w:rPr>
@@ -161,53 +184,30 @@
           <w:sz w:val="20"/>
           <w:szCs w:val="20"/>
         </w:rPr>
-        <w:t xml:space="preserve">RAG, LangGraph, vector search (pgvector, Azure AI Search), local LLMs (Qwen, Gemma), retrieval and groundedness evaluation</w:t>
-      </w:r>
-    </w:p>
-    <w:p>
-      <w:pPr>
-        <w:spacing w:after="20"/>
-      </w:pPr>
-      <w:r>
-        <w:rPr>
-          <w:rFonts w:ascii="Calibri" w:cs="Calibri" w:eastAsia="Calibri" w:hAnsi="Calibri"/>
-          <w:b/>
-          <w:bCs/>
-          <w:sz w:val="20"/>
-          <w:szCs w:val="20"/>
-        </w:rPr>
-        <w:t xml:space="preserve">Statistics and Evaluation: </w:t>
-      </w:r>
-      <w:r>
-        <w:rPr>
-          <w:rFonts w:ascii="Calibri" w:cs="Calibri" w:eastAsia="Calibri" w:hAnsi="Calibri"/>
-          <w:sz w:val="20"/>
-          <w:szCs w:val="20"/>
-        </w:rPr>
-        <w:t xml:space="preserve">conformal prediction, calibration, causal inference (Double ML), hypothesis testing, Bayesian optimization, multi-objective optimization (NSGA-III)</w:t>
-      </w:r>
-    </w:p>
-    <w:p>
-      <w:pPr>
-        <w:spacing w:after="20"/>
-      </w:pPr>
-      <w:r>
-        <w:rPr>
-          <w:rFonts w:ascii="Calibri" w:cs="Calibri" w:eastAsia="Calibri" w:hAnsi="Calibri"/>
-          <w:b/>
-          <w:bCs/>
-          <w:sz w:val="20"/>
-          <w:szCs w:val="20"/>
-        </w:rPr>
-        <w:t xml:space="preserve">Engineering: </w:t>
-      </w:r>
-      <w:r>
-        <w:rPr>
-          <w:rFonts w:ascii="Calibri" w:cs="Calibri" w:eastAsia="Calibri" w:hAnsi="Calibri"/>
-          <w:sz w:val="20"/>
-          <w:szCs w:val="20"/>
-        </w:rPr>
-        <w:t xml:space="preserve">FastAPI, React, PostgreSQL, Docker, Git, GitHub Actions, Linux, pytest</w:t>
+        <w:t xml:space="preserve">RAG, LangGraph, vector search (pgvector), local LLMs (Qwen, Gemma), retrieval and groundedness evaluation</w:t>
+      </w:r>
+    </w:p>
+    <w:p>
+      <w:pPr>
+        <w:spacing w:after="15"/>
+      </w:pPr>
+      <w:r>
+        <w:rPr>
+          <w:rFonts w:ascii="Calibri" w:cs="Calibri" w:eastAsia="Calibri" w:hAnsi="Calibri"/>
+          <w:b/>
+          <w:bCs/>
+          <w:sz w:val="20"/>
+          <w:szCs w:val="20"/>
+        </w:rPr>
+        <w:t xml:space="preserve">Statistics: </w:t>
+      </w:r>
+      <w:r>
+        <w:rPr>
+          <w:rFonts w:ascii="Calibri" w:cs="Calibri" w:eastAsia="Calibri" w:hAnsi="Calibri"/>
+          <w:sz w:val="20"/>
+          <w:szCs w:val="20"/>
+        </w:rPr>
+        <w:t xml:space="preserve">conformal prediction, calibration, causal inference (Double ML), hypothesis testing, Bayesian and multi-objective optimization</w:t>
       </w:r>
     </w:p>
     <w:p>
@@ -215,7 +215,7 @@
         <w:pBdr>
           <w:bottom w:val="single" w:color="000000" w:sz="6" w:space="1"/>
         </w:pBdr>
-        <w:spacing w:after="50" w:before="120"/>
+        <w:spacing w:after="45" w:before="110"/>
       </w:pPr>
       <w:r>
         <w:rPr>
@@ -230,10 +230,7 @@
     </w:p>
     <w:p>
       <w:pPr>
-        <w:tabs>
-          <w:tab w:val="right" w:pos="10760"/>
-        </w:tabs>
-        <w:spacing w:after="20" w:before="60"/>
+        <w:spacing w:after="15" w:before="55"/>
       </w:pPr>
       <w:r>
         <w:rPr>
@@ -263,7 +260,7 @@
           <w:ilvl w:val="0"/>
           <w:numId w:val="2"/>
         </w:numPr>
-        <w:spacing w:after="20"/>
+        <w:spacing w:after="15"/>
       </w:pPr>
       <w:r>
         <w:rPr>
@@ -281,7 +278,7 @@
           <w:ilvl w:val="0"/>
           <w:numId w:val="2"/>
         </w:numPr>
-        <w:spacing w:after="20"/>
+        <w:spacing w:after="15"/>
       </w:pPr>
       <w:r>
         <w:rPr>
@@ -294,20 +291,17 @@
     </w:p>
     <w:p>
       <w:pPr>
-        <w:tabs>
-          <w:tab w:val="right" w:pos="10760"/>
-        </w:tabs>
-        <w:spacing w:after="20" w:before="60"/>
-      </w:pPr>
-      <w:r>
-        <w:rPr>
-          <w:rFonts w:ascii="Calibri" w:cs="Calibri" w:eastAsia="Calibri" w:hAnsi="Calibri"/>
-          <w:b/>
-          <w:bCs/>
-          <w:sz w:val="20"/>
-          <w:szCs w:val="20"/>
-        </w:rPr>
-        <w:t xml:space="preserve">Cross-Task EEG Mental-Workload Decoding</w:t>
+        <w:spacing w:after="15" w:before="55"/>
+      </w:pPr>
+      <w:r>
+        <w:rPr>
+          <w:rFonts w:ascii="Calibri" w:cs="Calibri" w:eastAsia="Calibri" w:hAnsi="Calibri"/>
+          <w:b/>
+          <w:bCs/>
+          <w:sz w:val="20"/>
+          <w:szCs w:val="20"/>
+        </w:rPr>
+        <w:t xml:space="preserve">PalletCast: End-to-End MLOps for Warehouse Pallet Forecasting</w:t>
       </w:r>
       <w:r>
         <w:rPr>
@@ -317,7 +311,7 @@
           <w:sz w:val="20"/>
           <w:szCs w:val="20"/>
         </w:rPr>
-        <w:t xml:space="preserve">  |  Python, Riemannian ML, PyTorch</w:t>
+        <w:t xml:space="preserve">  |  Python, LightGBM, MLflow, Prefect, FastAPI, Docker, Evidently</w:t>
       </w:r>
     </w:p>
     <w:p>
@@ -327,15 +321,15 @@
           <w:ilvl w:val="0"/>
           <w:numId w:val="2"/>
         </w:numPr>
-        <w:spacing w:after="20"/>
-      </w:pPr>
-      <w:r>
-        <w:rPr>
-          <w:rFonts w:ascii="Calibri" w:cs="Calibri" w:eastAsia="Calibri" w:hAnsi="Calibri"/>
-          <w:sz w:val="20"/>
-          <w:szCs w:val="20"/>
-        </w:rPr>
-        <w:t xml:space="preserve">Showed workload decoders fall from 0.83-0.97 AUC on the trained task to 0.71 or lower on a new task; built a population low-rank decoder with self-training that reached 0.75 / 0.90 AUC, outperforming CORAL, Group-DRO and subject-specific baselines.</w:t>
+        <w:spacing w:after="15"/>
+      </w:pPr>
+      <w:r>
+        <w:rPr>
+          <w:rFonts w:ascii="Calibri" w:cs="Calibri" w:eastAsia="Calibri" w:hAnsi="Calibri"/>
+          <w:sz w:val="20"/>
+          <w:szCs w:val="20"/>
+        </w:rPr>
+        <w:t xml:space="preserve">Built a 14-day outbound-pallet forecasting system for an automated cold-storage operator across all nine MLOps stages: validated data with quarantine (pandera, DVC), point-in-time features, model registry with a promotion gate, monthly orchestration, a FastAPI service in Docker, monitoring and CI/CD.</w:t>
       </w:r>
     </w:p>
     <w:p>
@@ -345,33 +339,30 @@
           <w:ilvl w:val="0"/>
           <w:numId w:val="2"/>
         </w:numPr>
-        <w:spacing w:after="20"/>
-      </w:pPr>
-      <w:r>
-        <w:rPr>
-          <w:rFonts w:ascii="Calibri" w:cs="Calibri" w:eastAsia="Calibri" w:hAnsi="Calibri"/>
-          <w:sz w:val="20"/>
-          <w:szCs w:val="20"/>
-        </w:rPr>
-        <w:t xml:space="preserve">Discovered that 8 participant IDs in the public COG-BCI EEG dataset contain identical recordings and released a reproducible audit tool.</w:t>
-      </w:r>
-    </w:p>
-    <w:p>
-      <w:pPr>
-        <w:tabs>
-          <w:tab w:val="right" w:pos="10760"/>
-        </w:tabs>
-        <w:spacing w:after="20" w:before="60"/>
-      </w:pPr>
-      <w:r>
-        <w:rPr>
-          <w:rFonts w:ascii="Calibri" w:cs="Calibri" w:eastAsia="Calibri" w:hAnsi="Calibri"/>
-          <w:b/>
-          <w:bCs/>
-          <w:sz w:val="20"/>
-          <w:szCs w:val="20"/>
-        </w:rPr>
-        <w:t xml:space="preserve">INTERVENE: Graph Attention for Lung-Cancer Relapse</w:t>
+        <w:spacing w:after="15"/>
+      </w:pPr>
+      <w:r>
+        <w:rPr>
+          <w:rFonts w:ascii="Calibri" w:cs="Calibri" w:eastAsia="Calibri" w:hAnsi="Calibri"/>
+          <w:sz w:val="20"/>
+          <w:szCs w:val="20"/>
+        </w:rPr>
+        <w:t xml:space="preserve">Ran a fair contest of 17 models in 5 families (baselines, statistical, gradient boosting, Prophet, neural); the deployed model reached 10.8% WAPE vs 14.6% for the best simple rule and held 10.9% on unseen 2026 data.</w:t>
+      </w:r>
+    </w:p>
+    <w:p>
+      <w:pPr>
+        <w:spacing w:after="15" w:before="55"/>
+      </w:pPr>
+      <w:r>
+        <w:rPr>
+          <w:rFonts w:ascii="Calibri" w:cs="Calibri" w:eastAsia="Calibri" w:hAnsi="Calibri"/>
+          <w:b/>
+          <w:bCs/>
+          <w:sz w:val="20"/>
+          <w:szCs w:val="20"/>
+        </w:rPr>
+        <w:t xml:space="preserve">Cross-Task EEG Mental-Workload Decoding</w:t>
       </w:r>
       <w:r>
         <w:rPr>
@@ -381,7 +372,7 @@
           <w:sz w:val="20"/>
           <w:szCs w:val="20"/>
         </w:rPr>
-        <w:t xml:space="preserve">  |  PyTorch, Survival Analysis</w:t>
+        <w:t xml:space="preserve">  |  Python, Riemannian ML, PyTorch</w:t>
       </w:r>
     </w:p>
     <w:p>
@@ -391,43 +382,15 @@
           <w:ilvl w:val="0"/>
           <w:numId w:val="2"/>
         </w:numPr>
-        <w:spacing w:after="20"/>
-      </w:pPr>
-      <w:r>
-        <w:rPr>
-          <w:rFonts w:ascii="Calibri" w:cs="Calibri" w:eastAsia="Calibri" w:hAnsi="Calibri"/>
-          <w:sz w:val="20"/>
-          <w:szCs w:val="20"/>
-        </w:rPr>
-        <w:t xml:space="preserve">Designed graph-sparse attention over biological modules that identified a relapse signature with C-index 0.76 (vs 0.70 baseline, 0.50 permutation null), validated with ablations, multi-seed stability and 4 external cohorts.</w:t>
-      </w:r>
-    </w:p>
-    <w:p>
-      <w:pPr>
-        <w:tabs>
-          <w:tab w:val="right" w:pos="10760"/>
-        </w:tabs>
-        <w:spacing w:after="20" w:before="60"/>
-      </w:pPr>
-      <w:r>
-        <w:rPr>
-          <w:rFonts w:ascii="Calibri" w:cs="Calibri" w:eastAsia="Calibri" w:hAnsi="Calibri"/>
-          <w:b/>
-          <w:bCs/>
-          <w:sz w:val="20"/>
-          <w:szCs w:val="20"/>
-        </w:rPr>
-        <w:t xml:space="preserve">Curvature-Constrained Latent Diffusion</w:t>
-      </w:r>
-      <w:r>
-        <w:rPr>
-          <w:rFonts w:ascii="Calibri" w:cs="Calibri" w:eastAsia="Calibri" w:hAnsi="Calibri"/>
-          <w:i/>
-          <w:iCs/>
-          <w:sz w:val="20"/>
-          <w:szCs w:val="20"/>
-        </w:rPr>
-        <w:t xml:space="preserve">  |  PyTorch, Diffusion Models, Topology</w:t>
+        <w:spacing w:after="15"/>
+      </w:pPr>
+      <w:r>
+        <w:rPr>
+          <w:rFonts w:ascii="Calibri" w:cs="Calibri" w:eastAsia="Calibri" w:hAnsi="Calibri"/>
+          <w:sz w:val="20"/>
+          <w:szCs w:val="20"/>
+        </w:rPr>
+        <w:t xml:space="preserve">Showed workload decoders fall from 0.83-0.97 AUC on the trained task to 0.71 or lower on a new task; built a population low-rank decoder with self-training reaching 0.75 / 0.90 AUC, ahead of CORAL, Group-DRO and subject-specific baselines.</w:t>
       </w:r>
     </w:p>
     <w:p>
@@ -437,33 +400,30 @@
           <w:ilvl w:val="0"/>
           <w:numId w:val="2"/>
         </w:numPr>
-        <w:spacing w:after="20"/>
-      </w:pPr>
-      <w:r>
-        <w:rPr>
-          <w:rFonts w:ascii="Calibri" w:cs="Calibri" w:eastAsia="Calibri" w:hAnsi="Calibri"/>
-          <w:sz w:val="20"/>
-          <w:szCs w:val="20"/>
-        </w:rPr>
-        <w:t xml:space="preserve">Built a latent diffusion model for medical polyp masks with curvature guidance and topology projection, reducing topological (Betti/Euler) error from 1.48 to 0 with 99.7% area-target success.</w:t>
-      </w:r>
-    </w:p>
-    <w:p>
-      <w:pPr>
-        <w:tabs>
-          <w:tab w:val="right" w:pos="10760"/>
-        </w:tabs>
-        <w:spacing w:after="20" w:before="60"/>
-      </w:pPr>
-      <w:r>
-        <w:rPr>
-          <w:rFonts w:ascii="Calibri" w:cs="Calibri" w:eastAsia="Calibri" w:hAnsi="Calibri"/>
-          <w:b/>
-          <w:bCs/>
-          <w:sz w:val="20"/>
-          <w:szCs w:val="20"/>
-        </w:rPr>
-        <w:t xml:space="preserve">TransferGuard: Source Localization in Evolving Networks</w:t>
+        <w:spacing w:after="15"/>
+      </w:pPr>
+      <w:r>
+        <w:rPr>
+          <w:rFonts w:ascii="Calibri" w:cs="Calibri" w:eastAsia="Calibri" w:hAnsi="Calibri"/>
+          <w:sz w:val="20"/>
+          <w:szCs w:val="20"/>
+        </w:rPr>
+        <w:t xml:space="preserve">Discovered that 8 participant IDs in the public COG-BCI EEG dataset contain identical recordings and released a reproducible audit tool.</w:t>
+      </w:r>
+    </w:p>
+    <w:p>
+      <w:pPr>
+        <w:spacing w:after="15" w:before="55"/>
+      </w:pPr>
+      <w:r>
+        <w:rPr>
+          <w:rFonts w:ascii="Calibri" w:cs="Calibri" w:eastAsia="Calibri" w:hAnsi="Calibri"/>
+          <w:b/>
+          <w:bCs/>
+          <w:sz w:val="20"/>
+          <w:szCs w:val="20"/>
+        </w:rPr>
+        <w:t xml:space="preserve">INTERVENE: Graph Attention for Lung-Cancer Relapse</w:t>
       </w:r>
       <w:r>
         <w:rPr>
@@ -473,7 +433,7 @@
           <w:sz w:val="20"/>
           <w:szCs w:val="20"/>
         </w:rPr>
-        <w:t xml:space="preserve">  |  Temporal GNNs, Conformal Prediction</w:t>
+        <w:t xml:space="preserve">  |  PyTorch, Survival Analysis</w:t>
       </w:r>
     </w:p>
     <w:p>
@@ -483,33 +443,30 @@
           <w:ilvl w:val="0"/>
           <w:numId w:val="2"/>
         </w:numPr>
-        <w:spacing w:after="20"/>
-      </w:pPr>
-      <w:r>
-        <w:rPr>
-          <w:rFonts w:ascii="Calibri" w:cs="Calibri" w:eastAsia="Calibri" w:hAnsi="Calibri"/>
-          <w:sz w:val="20"/>
-          <w:szCs w:val="20"/>
-        </w:rPr>
-        <w:t xml:space="preserve">Combined temporal encoders with selectively admitted network-growth priors across 480 graph regimes and 1.19M IoT-23 events, improving low-evidence ranking (MRR +0.027 in the reliable subgroup) and documenting where fusion hurts.</w:t>
-      </w:r>
-    </w:p>
-    <w:p>
-      <w:pPr>
-        <w:tabs>
-          <w:tab w:val="right" w:pos="10760"/>
-        </w:tabs>
-        <w:spacing w:after="20" w:before="60"/>
-      </w:pPr>
-      <w:r>
-        <w:rPr>
-          <w:rFonts w:ascii="Calibri" w:cs="Calibri" w:eastAsia="Calibri" w:hAnsi="Calibri"/>
-          <w:b/>
-          <w:bCs/>
-          <w:sz w:val="20"/>
-          <w:szCs w:val="20"/>
-        </w:rPr>
-        <w:t xml:space="preserve">Enterprise Knowledge Copilot</w:t>
+        <w:spacing w:after="15"/>
+      </w:pPr>
+      <w:r>
+        <w:rPr>
+          <w:rFonts w:ascii="Calibri" w:cs="Calibri" w:eastAsia="Calibri" w:hAnsi="Calibri"/>
+          <w:sz w:val="20"/>
+          <w:szCs w:val="20"/>
+        </w:rPr>
+        <w:t xml:space="preserve">Designed graph-sparse attention over biological modules that identified a relapse signature with C-index 0.76 (vs 0.70 baseline, 0.50 permutation null), validated with ablations, multi-seed stability and 4 external cohorts.</w:t>
+      </w:r>
+    </w:p>
+    <w:p>
+      <w:pPr>
+        <w:spacing w:after="15" w:before="55"/>
+      </w:pPr>
+      <w:r>
+        <w:rPr>
+          <w:rFonts w:ascii="Calibri" w:cs="Calibri" w:eastAsia="Calibri" w:hAnsi="Calibri"/>
+          <w:b/>
+          <w:bCs/>
+          <w:sz w:val="20"/>
+          <w:szCs w:val="20"/>
+        </w:rPr>
+        <w:t xml:space="preserve">Curvature-Constrained Latent Diffusion</w:t>
       </w:r>
       <w:r>
         <w:rPr>
@@ -519,7 +476,7 @@
           <w:sz w:val="20"/>
           <w:szCs w:val="20"/>
         </w:rPr>
-        <w:t xml:space="preserve">  |  FastAPI, React, Azure AI Search, Docker</w:t>
+        <w:t xml:space="preserve">  |  PyTorch, Diffusion Models</w:t>
       </w:r>
     </w:p>
     <w:p>
@@ -529,33 +486,30 @@
           <w:ilvl w:val="0"/>
           <w:numId w:val="2"/>
         </w:numPr>
-        <w:spacing w:after="20"/>
-      </w:pPr>
-      <w:r>
-        <w:rPr>
-          <w:rFonts w:ascii="Calibri" w:cs="Calibri" w:eastAsia="Calibri" w:hAnsi="Calibri"/>
-          <w:sz w:val="20"/>
-          <w:szCs w:val="20"/>
-        </w:rPr>
-        <w:t xml:space="preserve">Built a governed hybrid-RAG platform with role-aware access, citation-grounded answers and unsupported-claim detection, evaluated with Hit@K, MRR, latency and groundedness.</w:t>
-      </w:r>
-    </w:p>
-    <w:p>
-      <w:pPr>
-        <w:tabs>
-          <w:tab w:val="right" w:pos="10760"/>
-        </w:tabs>
-        <w:spacing w:after="20" w:before="60"/>
-      </w:pPr>
-      <w:r>
-        <w:rPr>
-          <w:rFonts w:ascii="Calibri" w:cs="Calibri" w:eastAsia="Calibri" w:hAnsi="Calibri"/>
-          <w:b/>
-          <w:bCs/>
-          <w:sz w:val="20"/>
-          <w:szCs w:val="20"/>
-        </w:rPr>
-        <w:t xml:space="preserve">PIRGE-CodeGuard: Safety Layer for Coding Agents</w:t>
+        <w:spacing w:after="15"/>
+      </w:pPr>
+      <w:r>
+        <w:rPr>
+          <w:rFonts w:ascii="Calibri" w:cs="Calibri" w:eastAsia="Calibri" w:hAnsi="Calibri"/>
+          <w:sz w:val="20"/>
+          <w:szCs w:val="20"/>
+        </w:rPr>
+        <w:t xml:space="preserve">Built a latent diffusion model for medical polyp masks with curvature guidance and topology projection, reducing topological (Betti/Euler) error from 1.48 to 0 with 99.7% area-target success.</w:t>
+      </w:r>
+    </w:p>
+    <w:p>
+      <w:pPr>
+        <w:spacing w:after="15" w:before="55"/>
+      </w:pPr>
+      <w:r>
+        <w:rPr>
+          <w:rFonts w:ascii="Calibri" w:cs="Calibri" w:eastAsia="Calibri" w:hAnsi="Calibri"/>
+          <w:b/>
+          <w:bCs/>
+          <w:sz w:val="20"/>
+          <w:szCs w:val="20"/>
+        </w:rPr>
+        <w:t xml:space="preserve">Enterprise Knowledge Copilot</w:t>
       </w:r>
       <w:r>
         <w:rPr>
@@ -565,7 +519,7 @@
           <w:sz w:val="20"/>
           <w:szCs w:val="20"/>
         </w:rPr>
-        <w:t xml:space="preserve">  |  Python, LLM Agents</w:t>
+        <w:t xml:space="preserve">  |  FastAPI, React, Azure AI Search, Azure Blob Storage, Docker</w:t>
       </w:r>
     </w:p>
     <w:p>
@@ -575,20 +529,20 @@
           <w:ilvl w:val="0"/>
           <w:numId w:val="2"/>
         </w:numPr>
-        <w:spacing w:after="20"/>
-      </w:pPr>
-      <w:r>
-        <w:rPr>
-          <w:rFonts w:ascii="Calibri" w:cs="Calibri" w:eastAsia="Calibri" w:hAnsi="Calibri"/>
-          <w:sz w:val="20"/>
-          <w:szCs w:val="20"/>
-        </w:rPr>
-        <w:t xml:space="preserve">Converted coding-agent actions into provenance-checked warrants before execution; on real Qwen Coder traces it blocked all 16 risky actions and executed all 7 safe ones.</w:t>
-      </w:r>
-    </w:p>
-    <w:p>
-      <w:pPr>
-        <w:spacing w:after="20"/>
+        <w:spacing w:after="15"/>
+      </w:pPr>
+      <w:r>
+        <w:rPr>
+          <w:rFonts w:ascii="Calibri" w:cs="Calibri" w:eastAsia="Calibri" w:hAnsi="Calibri"/>
+          <w:sz w:val="20"/>
+          <w:szCs w:val="20"/>
+        </w:rPr>
+        <w:t xml:space="preserve">Built a governed hybrid-RAG platform with role-aware access, citation-grounded answers and unsupported-claim detection, evaluated with Hit@K, MRR, latency and groundedness.</w:t>
+      </w:r>
+    </w:p>
+    <w:p>
+      <w:pPr>
+        <w:spacing w:after="15"/>
       </w:pPr>
       <w:r>
         <w:rPr>
@@ -606,7 +560,7 @@
           <w:sz w:val="20"/>
           <w:szCs w:val="20"/>
         </w:rPr>
-        <w:t xml:space="preserve">ClearDue (agentic finance operations, LangGraph), QCertRoute (shot-adaptive quantum expert routing), CarbonTwin-R (causal digital twin, conformal uncertainty), Graph-Spectral Early-Warning Signals, MethaneTwin-R, chaosctl (AI chaos engineering, Bosch hackathon), GLUCO-ADAPT. Code: github.com/Kxvya18</w:t>
+        <w:t xml:space="preserve">PIRGE-CodeGuard (pre-execution safety for coding agents), TransferGuard (temporal graph source localization), ClearDue (agentic finance operations, LangGraph), QCertRoute (shot-adaptive quantum routing), CarbonTwin-R, MOGA-FCM, Graph-Spectral Early-Warning Signals, chaosctl (AI chaos engineering, Bosch hackathon). Code: github.com/Kxvya18</w:t>
       </w:r>
     </w:p>
     <w:p>
@@ -614,7 +568,7 @@
         <w:pBdr>
           <w:bottom w:val="single" w:color="000000" w:sz="6" w:space="1"/>
         </w:pBdr>
-        <w:spacing w:after="50" w:before="120"/>
+        <w:spacing w:after="45" w:before="110"/>
       </w:pPr>
       <w:r>
         <w:rPr>
@@ -624,7 +578,7 @@
           <w:sz w:val="22"/>
           <w:szCs w:val="22"/>
         </w:rPr>
-        <w:t xml:space="preserve">RESEARCH MANUSCRIPTS</w:t>
+        <w:t xml:space="preserve">PUBLICATIONS</w:t>
       </w:r>
     </w:p>
     <w:p>
@@ -634,15 +588,15 @@
           <w:ilvl w:val="0"/>
           <w:numId w:val="2"/>
         </w:numPr>
-        <w:spacing w:after="20"/>
-      </w:pPr>
-      <w:r>
-        <w:rPr>
-          <w:rFonts w:ascii="Calibri" w:cs="Calibri" w:eastAsia="Calibri" w:hAnsi="Calibri"/>
-          <w:sz w:val="20"/>
-          <w:szCs w:val="20"/>
-        </w:rPr>
-        <w:t xml:space="preserve">Contextualization-Aware Adapter Placement for Sampling-Rate Transfer in Wearable Machine Learning (manuscript).</w:t>
+        <w:spacing w:after="15"/>
+      </w:pPr>
+      <w:r>
+        <w:rPr>
+          <w:rFonts w:ascii="Calibri" w:cs="Calibri" w:eastAsia="Calibri" w:hAnsi="Calibri"/>
+          <w:sz w:val="20"/>
+          <w:szCs w:val="20"/>
+        </w:rPr>
+        <w:t xml:space="preserve">K. Kalavala, A. Pandey, S. Priya, "MOGA-FCM: Unsupervised Cognitive Load Detection via Multi-Objective Genetic Algorithms and Bayesian Fuzzy C-Means in ADAS," 2nd Congress on Intelligent Machines and Algorithms (CIMA 2026), NIT Puducherry.</w:t>
       </w:r>
     </w:p>
     <w:p>
@@ -652,15 +606,15 @@
           <w:ilvl w:val="0"/>
           <w:numId w:val="2"/>
         </w:numPr>
-        <w:spacing w:after="20"/>
-      </w:pPr>
-      <w:r>
-        <w:rPr>
-          <w:rFonts w:ascii="Calibri" w:cs="Calibri" w:eastAsia="Calibri" w:hAnsi="Calibri"/>
-          <w:sz w:val="20"/>
-          <w:szCs w:val="20"/>
-        </w:rPr>
-        <w:t xml:space="preserve">Curvature-Audited Boltzmann Evidence for Source Localization in Evolving Networks; Shot-Adaptive Quantum Expert Routing with Certified Top-Ten Decisions (manuscripts in preparation).</w:t>
+        <w:spacing w:after="15"/>
+      </w:pPr>
+      <w:r>
+        <w:rPr>
+          <w:rFonts w:ascii="Calibri" w:cs="Calibri" w:eastAsia="Calibri" w:hAnsi="Calibri"/>
+          <w:sz w:val="20"/>
+          <w:szCs w:val="20"/>
+        </w:rPr>
+        <w:t xml:space="preserve">Manuscripts in preparation: Curvature-Audited Boltzmann Evidence for Source Localization in Evolving Networks; Shot-Adaptive Quantum Expert Routing with Certified Top-Ten Decisions.</w:t>
       </w:r>
     </w:p>
     <w:p>
@@ -668,7 +622,7 @@
         <w:pBdr>
           <w:bottom w:val="single" w:color="000000" w:sz="6" w:space="1"/>
         </w:pBdr>
-        <w:spacing w:after="50" w:before="120"/>
+        <w:spacing w:after="45" w:before="110"/>
       </w:pPr>
       <w:r>
         <w:rPr>
@@ -709,7 +663,7 @@
     </w:p>
     <w:p>
       <w:pPr>
-        <w:spacing w:after="20"/>
+        <w:spacing w:after="15"/>
       </w:pPr>
       <w:r>
         <w:rPr>
@@ -722,7 +676,7 @@
     </w:p>
     <w:p>
       <w:pPr>
-        <w:spacing w:after="20"/>
+        <w:spacing w:after="15"/>
       </w:pPr>
       <w:r>
         <w:rPr>
@@ -738,7 +692,7 @@
         <w:pBdr>
           <w:bottom w:val="single" w:color="000000" w:sz="6" w:space="1"/>
         </w:pBdr>
-        <w:spacing w:after="50" w:before="120"/>
+        <w:spacing w:after="45" w:before="110"/>
       </w:pPr>
       <w:r>
         <w:rPr>
@@ -753,7 +707,7 @@
     </w:p>
     <w:p>
       <w:pPr>
-        <w:spacing w:after="20"/>
+        <w:spacing w:after="15"/>
       </w:pPr>
       <w:r>
         <w:rPr>
@@ -766,7 +720,7 @@
     </w:p>
     <w:sectPr>
       <w:pgSz w:w="11906" w:h="16838" w:orient="portrait"/>
-      <w:pgMar w:top="570" w:right="570" w:bottom="570" w:left="570" w:header="708" w:footer="708" w:gutter="0"/>
+      <w:pgMar w:top="540" w:right="570" w:bottom="540" w:left="570" w:header="708" w:footer="708" w:gutter="0"/>
       <w:pgNumType/>
       <w:docGrid w:linePitch="360"/>
     </w:sectPr>

</xml_diff>

<commit_message>
Add CensusAI pipeline work; resume with experience section
</commit_message>
<xml_diff>
--- a/public/Kavya_Kalavala_Resume.docx
+++ b/public/Kavya_Kalavala_Resume.docx
@@ -92,156 +92,39 @@
           <w:sz w:val="22"/>
           <w:szCs w:val="22"/>
         </w:rPr>
-        <w:t xml:space="preserve">TECHNICAL SKILLS</w:t>
-      </w:r>
-    </w:p>
-    <w:p>
-      <w:pPr>
-        <w:spacing w:after="15"/>
-      </w:pPr>
-      <w:r>
-        <w:rPr>
-          <w:rFonts w:ascii="Calibri" w:cs="Calibri" w:eastAsia="Calibri" w:hAnsi="Calibri"/>
-          <w:b/>
-          <w:bCs/>
-          <w:sz w:val="20"/>
-          <w:szCs w:val="20"/>
-        </w:rPr>
-        <w:t xml:space="preserve">Languages: </w:t>
-      </w:r>
-      <w:r>
-        <w:rPr>
-          <w:rFonts w:ascii="Calibri" w:cs="Calibri" w:eastAsia="Calibri" w:hAnsi="Calibri"/>
-          <w:sz w:val="20"/>
-          <w:szCs w:val="20"/>
-        </w:rPr>
-        <w:t xml:space="preserve">Python, C++, C, Java, SQL, TypeScript</w:t>
-      </w:r>
-    </w:p>
-    <w:p>
-      <w:pPr>
-        <w:spacing w:after="15"/>
-      </w:pPr>
-      <w:r>
-        <w:rPr>
-          <w:rFonts w:ascii="Calibri" w:cs="Calibri" w:eastAsia="Calibri" w:hAnsi="Calibri"/>
-          <w:b/>
-          <w:bCs/>
-          <w:sz w:val="20"/>
-          <w:szCs w:val="20"/>
-        </w:rPr>
-        <w:t xml:space="preserve">Machine Learning: </w:t>
-      </w:r>
-      <w:r>
-        <w:rPr>
-          <w:rFonts w:ascii="Calibri" w:cs="Calibri" w:eastAsia="Calibri" w:hAnsi="Calibri"/>
-          <w:sz w:val="20"/>
-          <w:szCs w:val="20"/>
-        </w:rPr>
-        <w:t xml:space="preserve">PyTorch, scikit-learn, XGBoost, LightGBM, PyTorch Geometric, graph neural networks, diffusion models, time-series forecasting, Riemannian (SPD) methods</w:t>
-      </w:r>
-    </w:p>
-    <w:p>
-      <w:pPr>
-        <w:spacing w:after="15"/>
-      </w:pPr>
-      <w:r>
-        <w:rPr>
-          <w:rFonts w:ascii="Calibri" w:cs="Calibri" w:eastAsia="Calibri" w:hAnsi="Calibri"/>
-          <w:b/>
-          <w:bCs/>
-          <w:sz w:val="20"/>
-          <w:szCs w:val="20"/>
-        </w:rPr>
-        <w:t xml:space="preserve">MLOps and Engineering: </w:t>
-      </w:r>
-      <w:r>
-        <w:rPr>
-          <w:rFonts w:ascii="Calibri" w:cs="Calibri" w:eastAsia="Calibri" w:hAnsi="Calibri"/>
-          <w:sz w:val="20"/>
-          <w:szCs w:val="20"/>
-        </w:rPr>
-        <w:t xml:space="preserve">MLflow, DVC, Prefect, Evidently, FastAPI, Docker, GitHub Actions, PostgreSQL, Azure AI Search, Linux</w:t>
-      </w:r>
-    </w:p>
-    <w:p>
-      <w:pPr>
-        <w:spacing w:after="15"/>
-      </w:pPr>
-      <w:r>
-        <w:rPr>
-          <w:rFonts w:ascii="Calibri" w:cs="Calibri" w:eastAsia="Calibri" w:hAnsi="Calibri"/>
-          <w:b/>
-          <w:bCs/>
-          <w:sz w:val="20"/>
-          <w:szCs w:val="20"/>
-        </w:rPr>
-        <w:t xml:space="preserve">LLMs and Agents: </w:t>
-      </w:r>
-      <w:r>
-        <w:rPr>
-          <w:rFonts w:ascii="Calibri" w:cs="Calibri" w:eastAsia="Calibri" w:hAnsi="Calibri"/>
-          <w:sz w:val="20"/>
-          <w:szCs w:val="20"/>
-        </w:rPr>
-        <w:t xml:space="preserve">RAG, LangGraph, vector search (pgvector), local LLMs (Qwen, Gemma), retrieval and groundedness evaluation</w:t>
-      </w:r>
-    </w:p>
-    <w:p>
-      <w:pPr>
-        <w:spacing w:after="15"/>
-      </w:pPr>
-      <w:r>
-        <w:rPr>
-          <w:rFonts w:ascii="Calibri" w:cs="Calibri" w:eastAsia="Calibri" w:hAnsi="Calibri"/>
-          <w:b/>
-          <w:bCs/>
-          <w:sz w:val="20"/>
-          <w:szCs w:val="20"/>
-        </w:rPr>
-        <w:t xml:space="preserve">Statistics: </w:t>
-      </w:r>
-      <w:r>
-        <w:rPr>
-          <w:rFonts w:ascii="Calibri" w:cs="Calibri" w:eastAsia="Calibri" w:hAnsi="Calibri"/>
-          <w:sz w:val="20"/>
-          <w:szCs w:val="20"/>
-        </w:rPr>
-        <w:t xml:space="preserve">conformal prediction, calibration, causal inference (Double ML), hypothesis testing, Bayesian and multi-objective optimization</w:t>
-      </w:r>
-    </w:p>
-    <w:p>
-      <w:pPr>
-        <w:pBdr>
-          <w:bottom w:val="single" w:color="000000" w:sz="6" w:space="1"/>
-        </w:pBdr>
-        <w:spacing w:after="45" w:before="110"/>
-      </w:pPr>
-      <w:r>
-        <w:rPr>
-          <w:rFonts w:ascii="Calibri" w:cs="Calibri" w:eastAsia="Calibri" w:hAnsi="Calibri"/>
-          <w:b/>
-          <w:bCs/>
-          <w:sz w:val="22"/>
-          <w:szCs w:val="22"/>
-        </w:rPr>
-        <w:t xml:space="preserve">PROJECTS</w:t>
-      </w:r>
-    </w:p>
-    <w:p>
-      <w:pPr>
-        <w:spacing w:after="15" w:before="55"/>
-      </w:pPr>
-      <w:r>
-        <w:rPr>
-          <w:rFonts w:ascii="Calibri" w:cs="Calibri" w:eastAsia="Calibri" w:hAnsi="Calibri"/>
-          <w:b/>
-          <w:bCs/>
-          <w:sz w:val="20"/>
-          <w:szCs w:val="20"/>
-        </w:rPr>
-        <w:t xml:space="preserve">DelegNet: Malicious Crypto-Wallet Delegation Detection</w:t>
-      </w:r>
+        <w:t xml:space="preserve">EXPERIENCE</w:t>
+      </w:r>
+    </w:p>
+    <w:p>
+      <w:pPr>
+        <w:tabs>
+          <w:tab w:val="right" w:pos="10760"/>
+        </w:tabs>
+        <w:spacing w:after="15" w:before="40"/>
+      </w:pPr>
+      <w:r>
+        <w:rPr>
+          <w:rFonts w:ascii="Calibri" w:cs="Calibri" w:eastAsia="Calibri" w:hAnsi="Calibri"/>
+          <w:b/>
+          <w:bCs/>
+          <w:sz w:val="20"/>
+          <w:szCs w:val="20"/>
+        </w:rPr>
+        <w:t xml:space="preserve">Data Pipeline Engineer (Remote), CensusAI, Australia</w:t>
+      </w:r>
+      <w:r>
+        <w:rPr>
+          <w:rFonts w:ascii="Calibri" w:cs="Calibri" w:eastAsia="Calibri" w:hAnsi="Calibri"/>
+          <w:sz w:val="20"/>
+          <w:szCs w:val="20"/>
+        </w:rPr>
+        <w:t xml:space="preserve">	Sep 2026 - Oct 2026</w:t>
+      </w:r>
+    </w:p>
+    <w:p>
+      <w:pPr>
+        <w:spacing w:after="15"/>
+      </w:pPr>
       <w:r>
         <w:rPr>
           <w:rFonts w:ascii="Calibri" w:cs="Calibri" w:eastAsia="Calibri" w:hAnsi="Calibri"/>
@@ -250,7 +133,7 @@
           <w:sz w:val="20"/>
           <w:szCs w:val="20"/>
         </w:rPr>
-        <w:t xml:space="preserve">  |  Python, PyTorch, Temporal GNNs</w:t>
+        <w:t xml:space="preserve">Python, DuckDB, Polars, PyArrow, Parquet, SQL</w:t>
       </w:r>
     </w:p>
     <w:p>
@@ -268,7 +151,7 @@
           <w:sz w:val="20"/>
           <w:szCs w:val="20"/>
         </w:rPr>
-        <w:t xml:space="preserve">Built a bytecode-only detector for malicious Ethereum EIP-7702 delegations that removes attacker code disguises and scores contracts against known theft patterns; released a labelled dataset of 637,846 real authorizations.</w:t>
+        <w:t xml:space="preserve">Optimised the data pipeline of an Australian Bureau of Statistics census platform (2011-2021 DataPacks) that builds a 2.03-billion-row analytical database from Parquet layers.</w:t>
       </w:r>
     </w:p>
     <w:p>
@@ -286,7 +169,135 @@
           <w:sz w:val="20"/>
           <w:szCs w:val="20"/>
         </w:rPr>
-        <w:t xml:space="preserve">On unseen contract families, kept 0.984 recall under every evasion attack with a 0.16% false-alarm rate, while temporal GNN baselines lost up to 77% recall.</w:t>
+        <w:t xml:space="preserve">Redesigned the artifact build to transform Bronze Parquet directly inside DuckDB instead of writing an intermediate Silver copy, cutting build time from 2,974 s to 2,043 s (31% faster) at 4.5 GB peak memory, and removed a full rescan of the fact table.</w:t>
+      </w:r>
+    </w:p>
+    <w:p>
+      <w:pPr>
+        <w:pBdr>
+          <w:bottom w:val="single" w:color="000000" w:sz="6" w:space="1"/>
+        </w:pBdr>
+        <w:spacing w:after="45" w:before="110"/>
+      </w:pPr>
+      <w:r>
+        <w:rPr>
+          <w:rFonts w:ascii="Calibri" w:cs="Calibri" w:eastAsia="Calibri" w:hAnsi="Calibri"/>
+          <w:b/>
+          <w:bCs/>
+          <w:sz w:val="22"/>
+          <w:szCs w:val="22"/>
+        </w:rPr>
+        <w:t xml:space="preserve">TECHNICAL SKILLS</w:t>
+      </w:r>
+    </w:p>
+    <w:p>
+      <w:pPr>
+        <w:spacing w:after="15"/>
+      </w:pPr>
+      <w:r>
+        <w:rPr>
+          <w:rFonts w:ascii="Calibri" w:cs="Calibri" w:eastAsia="Calibri" w:hAnsi="Calibri"/>
+          <w:b/>
+          <w:bCs/>
+          <w:sz w:val="20"/>
+          <w:szCs w:val="20"/>
+        </w:rPr>
+        <w:t xml:space="preserve">Languages: </w:t>
+      </w:r>
+      <w:r>
+        <w:rPr>
+          <w:rFonts w:ascii="Calibri" w:cs="Calibri" w:eastAsia="Calibri" w:hAnsi="Calibri"/>
+          <w:sz w:val="20"/>
+          <w:szCs w:val="20"/>
+        </w:rPr>
+        <w:t xml:space="preserve">Python, C++, C, Java, SQL, TypeScript</w:t>
+      </w:r>
+    </w:p>
+    <w:p>
+      <w:pPr>
+        <w:spacing w:after="15"/>
+      </w:pPr>
+      <w:r>
+        <w:rPr>
+          <w:rFonts w:ascii="Calibri" w:cs="Calibri" w:eastAsia="Calibri" w:hAnsi="Calibri"/>
+          <w:b/>
+          <w:bCs/>
+          <w:sz w:val="20"/>
+          <w:szCs w:val="20"/>
+        </w:rPr>
+        <w:t xml:space="preserve">Machine Learning: </w:t>
+      </w:r>
+      <w:r>
+        <w:rPr>
+          <w:rFonts w:ascii="Calibri" w:cs="Calibri" w:eastAsia="Calibri" w:hAnsi="Calibri"/>
+          <w:sz w:val="20"/>
+          <w:szCs w:val="20"/>
+        </w:rPr>
+        <w:t xml:space="preserve">PyTorch, scikit-learn, XGBoost, LightGBM, PyTorch Geometric, GNNs, diffusion models, time-series forecasting, conformal prediction, causal inference, Bayesian optimization</w:t>
+      </w:r>
+    </w:p>
+    <w:p>
+      <w:pPr>
+        <w:spacing w:after="15"/>
+      </w:pPr>
+      <w:r>
+        <w:rPr>
+          <w:rFonts w:ascii="Calibri" w:cs="Calibri" w:eastAsia="Calibri" w:hAnsi="Calibri"/>
+          <w:b/>
+          <w:bCs/>
+          <w:sz w:val="20"/>
+          <w:szCs w:val="20"/>
+        </w:rPr>
+        <w:t xml:space="preserve">MLOps and Data: </w:t>
+      </w:r>
+      <w:r>
+        <w:rPr>
+          <w:rFonts w:ascii="Calibri" w:cs="Calibri" w:eastAsia="Calibri" w:hAnsi="Calibri"/>
+          <w:sz w:val="20"/>
+          <w:szCs w:val="20"/>
+        </w:rPr>
+        <w:t xml:space="preserve">MLflow, DVC, Prefect, Evidently, FastAPI, Docker, GitHub Actions, DuckDB, Polars, PostgreSQL, Azure AI Search</w:t>
+      </w:r>
+    </w:p>
+    <w:p>
+      <w:pPr>
+        <w:spacing w:after="15"/>
+      </w:pPr>
+      <w:r>
+        <w:rPr>
+          <w:rFonts w:ascii="Calibri" w:cs="Calibri" w:eastAsia="Calibri" w:hAnsi="Calibri"/>
+          <w:b/>
+          <w:bCs/>
+          <w:sz w:val="20"/>
+          <w:szCs w:val="20"/>
+        </w:rPr>
+        <w:t xml:space="preserve">LLMs and Agents: </w:t>
+      </w:r>
+      <w:r>
+        <w:rPr>
+          <w:rFonts w:ascii="Calibri" w:cs="Calibri" w:eastAsia="Calibri" w:hAnsi="Calibri"/>
+          <w:sz w:val="20"/>
+          <w:szCs w:val="20"/>
+        </w:rPr>
+        <w:t xml:space="preserve">RAG, LangGraph, vector search (pgvector), local LLMs (Qwen, Gemma), retrieval and groundedness evaluation</w:t>
+      </w:r>
+    </w:p>
+    <w:p>
+      <w:pPr>
+        <w:pBdr>
+          <w:bottom w:val="single" w:color="000000" w:sz="6" w:space="1"/>
+        </w:pBdr>
+        <w:spacing w:after="45" w:before="110"/>
+      </w:pPr>
+      <w:r>
+        <w:rPr>
+          <w:rFonts w:ascii="Calibri" w:cs="Calibri" w:eastAsia="Calibri" w:hAnsi="Calibri"/>
+          <w:b/>
+          <w:bCs/>
+          <w:sz w:val="22"/>
+          <w:szCs w:val="22"/>
+        </w:rPr>
+        <w:t xml:space="preserve">PROJECTS</w:t>
       </w:r>
     </w:p>
     <w:p>
@@ -362,7 +373,7 @@
           <w:sz w:val="20"/>
           <w:szCs w:val="20"/>
         </w:rPr>
-        <w:t xml:space="preserve">Cross-Task EEG Mental-Workload Decoding</w:t>
+        <w:t xml:space="preserve">DelegNet: Malicious Crypto-Wallet Delegation Detection</w:t>
       </w:r>
       <w:r>
         <w:rPr>
@@ -372,7 +383,7 @@
           <w:sz w:val="20"/>
           <w:szCs w:val="20"/>
         </w:rPr>
-        <w:t xml:space="preserve">  |  Python, Riemannian ML, PyTorch</w:t>
+        <w:t xml:space="preserve">  |  Python, PyTorch, Temporal GNNs</w:t>
       </w:r>
     </w:p>
     <w:p>
@@ -390,7 +401,7 @@
           <w:sz w:val="20"/>
           <w:szCs w:val="20"/>
         </w:rPr>
-        <w:t xml:space="preserve">Showed workload decoders fall from 0.83-0.97 AUC on the trained task to 0.71 or lower on a new task; built a population low-rank decoder with self-training reaching 0.75 / 0.90 AUC, ahead of CORAL, Group-DRO and subject-specific baselines.</w:t>
+        <w:t xml:space="preserve">Built a bytecode-only detector for malicious Ethereum EIP-7702 delegations that removes attacker code disguises and scores contracts against known theft patterns; released a labelled dataset of 637,846 real authorizations.</w:t>
       </w:r>
     </w:p>
     <w:p>
@@ -408,7 +419,7 @@
           <w:sz w:val="20"/>
           <w:szCs w:val="20"/>
         </w:rPr>
-        <w:t xml:space="preserve">Discovered that 8 participant IDs in the public COG-BCI EEG dataset contain identical recordings and released a reproducible audit tool.</w:t>
+        <w:t xml:space="preserve">On unseen contract families, kept 0.984 recall under every evasion attack with a 0.16% false-alarm rate, while temporal GNN baselines lost up to 77% recall.</w:t>
       </w:r>
     </w:p>
     <w:p>
@@ -423,7 +434,7 @@
           <w:sz w:val="20"/>
           <w:szCs w:val="20"/>
         </w:rPr>
-        <w:t xml:space="preserve">INTERVENE: Graph Attention for Lung-Cancer Relapse</w:t>
+        <w:t xml:space="preserve">Cross-Task EEG Mental-Workload Decoding</w:t>
       </w:r>
       <w:r>
         <w:rPr>
@@ -433,7 +444,7 @@
           <w:sz w:val="20"/>
           <w:szCs w:val="20"/>
         </w:rPr>
-        <w:t xml:space="preserve">  |  PyTorch, Survival Analysis</w:t>
+        <w:t xml:space="preserve">  |  Python, Riemannian ML, PyTorch</w:t>
       </w:r>
     </w:p>
     <w:p>
@@ -451,32 +462,7 @@
           <w:sz w:val="20"/>
           <w:szCs w:val="20"/>
         </w:rPr>
-        <w:t xml:space="preserve">Designed graph-sparse attention over biological modules that identified a relapse signature with C-index 0.76 (vs 0.70 baseline, 0.50 permutation null), validated with ablations, multi-seed stability and 4 external cohorts.</w:t>
-      </w:r>
-    </w:p>
-    <w:p>
-      <w:pPr>
-        <w:spacing w:after="15" w:before="55"/>
-      </w:pPr>
-      <w:r>
-        <w:rPr>
-          <w:rFonts w:ascii="Calibri" w:cs="Calibri" w:eastAsia="Calibri" w:hAnsi="Calibri"/>
-          <w:b/>
-          <w:bCs/>
-          <w:sz w:val="20"/>
-          <w:szCs w:val="20"/>
-        </w:rPr>
-        <w:t xml:space="preserve">Curvature-Constrained Latent Diffusion</w:t>
-      </w:r>
-      <w:r>
-        <w:rPr>
-          <w:rFonts w:ascii="Calibri" w:cs="Calibri" w:eastAsia="Calibri" w:hAnsi="Calibri"/>
-          <w:i/>
-          <w:iCs/>
-          <w:sz w:val="20"/>
-          <w:szCs w:val="20"/>
-        </w:rPr>
-        <w:t xml:space="preserve">  |  PyTorch, Diffusion Models</w:t>
+        <w:t xml:space="preserve">Showed workload decoders fall from 0.83-0.97 AUC on the trained task to 0.71 or lower on a new task; built a population low-rank decoder with self-training reaching 0.75 / 0.90 AUC, ahead of CORAL, Group-DRO and subject-specific baselines.</w:t>
       </w:r>
     </w:p>
     <w:p>
@@ -494,7 +480,7 @@
           <w:sz w:val="20"/>
           <w:szCs w:val="20"/>
         </w:rPr>
-        <w:t xml:space="preserve">Built a latent diffusion model for medical polyp masks with curvature guidance and topology projection, reducing topological (Betti/Euler) error from 1.48 to 0 with 99.7% area-target success.</w:t>
+        <w:t xml:space="preserve">Discovered that 8 participant IDs in the public COG-BCI EEG dataset contain identical recordings and released a reproducible audit tool.</w:t>
       </w:r>
     </w:p>
     <w:p>
@@ -509,7 +495,7 @@
           <w:sz w:val="20"/>
           <w:szCs w:val="20"/>
         </w:rPr>
-        <w:t xml:space="preserve">Enterprise Knowledge Copilot</w:t>
+        <w:t xml:space="preserve">INTERVENE: Graph Attention for Lung-Cancer Relapse</w:t>
       </w:r>
       <w:r>
         <w:rPr>
@@ -519,7 +505,7 @@
           <w:sz w:val="20"/>
           <w:szCs w:val="20"/>
         </w:rPr>
-        <w:t xml:space="preserve">  |  FastAPI, React, Azure AI Search, Azure Blob Storage, Docker</w:t>
+        <w:t xml:space="preserve">  |  PyTorch, Survival Analysis</w:t>
       </w:r>
     </w:p>
     <w:p>
@@ -537,48 +523,32 @@
           <w:sz w:val="20"/>
           <w:szCs w:val="20"/>
         </w:rPr>
-        <w:t xml:space="preserve">Built a governed hybrid-RAG platform with role-aware access, citation-grounded answers and unsupported-claim detection, evaluated with Hit@K, MRR, latency and groundedness.</w:t>
-      </w:r>
-    </w:p>
-    <w:p>
-      <w:pPr>
-        <w:spacing w:after="15"/>
-      </w:pPr>
-      <w:r>
-        <w:rPr>
-          <w:rFonts w:ascii="Calibri" w:cs="Calibri" w:eastAsia="Calibri" w:hAnsi="Calibri"/>
-          <w:b/>
-          <w:bCs/>
-          <w:sz w:val="20"/>
-          <w:szCs w:val="20"/>
-        </w:rPr>
-        <w:t xml:space="preserve">Additional projects: </w:t>
-      </w:r>
-      <w:r>
-        <w:rPr>
-          <w:rFonts w:ascii="Calibri" w:cs="Calibri" w:eastAsia="Calibri" w:hAnsi="Calibri"/>
-          <w:sz w:val="20"/>
-          <w:szCs w:val="20"/>
-        </w:rPr>
-        <w:t xml:space="preserve">PIRGE-CodeGuard (pre-execution safety for coding agents), TransferGuard (temporal graph source localization), ClearDue (agentic finance operations, LangGraph), QCertRoute (shot-adaptive quantum routing), CarbonTwin-R, MOGA-FCM, Graph-Spectral Early-Warning Signals, chaosctl (AI chaos engineering, Bosch hackathon). Code: github.com/Kxvya18</w:t>
-      </w:r>
-    </w:p>
-    <w:p>
-      <w:pPr>
-        <w:pBdr>
-          <w:bottom w:val="single" w:color="000000" w:sz="6" w:space="1"/>
-        </w:pBdr>
-        <w:spacing w:after="45" w:before="110"/>
-      </w:pPr>
-      <w:r>
-        <w:rPr>
-          <w:rFonts w:ascii="Calibri" w:cs="Calibri" w:eastAsia="Calibri" w:hAnsi="Calibri"/>
-          <w:b/>
-          <w:bCs/>
-          <w:sz w:val="22"/>
-          <w:szCs w:val="22"/>
-        </w:rPr>
-        <w:t xml:space="preserve">PUBLICATIONS</w:t>
+        <w:t xml:space="preserve">Designed graph-sparse attention over biological modules that identified a relapse signature with C-index 0.76 (vs 0.70 baseline, 0.50 permutation null), validated with ablations, multi-seed stability and 4 external cohorts.</w:t>
+      </w:r>
+    </w:p>
+    <w:p>
+      <w:pPr>
+        <w:spacing w:after="15" w:before="55"/>
+      </w:pPr>
+      <w:r>
+        <w:rPr>
+          <w:rFonts w:ascii="Calibri" w:cs="Calibri" w:eastAsia="Calibri" w:hAnsi="Calibri"/>
+          <w:b/>
+          <w:bCs/>
+          <w:sz w:val="20"/>
+          <w:szCs w:val="20"/>
+        </w:rPr>
+        <w:t xml:space="preserve">Enterprise Knowledge Copilot</w:t>
+      </w:r>
+      <w:r>
+        <w:rPr>
+          <w:rFonts w:ascii="Calibri" w:cs="Calibri" w:eastAsia="Calibri" w:hAnsi="Calibri"/>
+          <w:i/>
+          <w:iCs/>
+          <w:sz w:val="20"/>
+          <w:szCs w:val="20"/>
+        </w:rPr>
+        <w:t xml:space="preserve">  |  FastAPI, React, Azure AI Search, Azure Blob Storage, Docker</w:t>
       </w:r>
     </w:p>
     <w:p>
@@ -596,7 +566,48 @@
           <w:sz w:val="20"/>
           <w:szCs w:val="20"/>
         </w:rPr>
-        <w:t xml:space="preserve">K. Kalavala, A. Pandey, S. Priya, "MOGA-FCM: Unsupervised Cognitive Load Detection via Multi-Objective Genetic Algorithms and Bayesian Fuzzy C-Means in ADAS," 2nd Congress on Intelligent Machines and Algorithms (CIMA 2026), NIT Puducherry.</w:t>
+        <w:t xml:space="preserve">Built a governed hybrid-RAG platform with role-aware access, citation-grounded answers and unsupported-claim detection, evaluated with Hit@K, MRR, latency and groundedness.</w:t>
+      </w:r>
+    </w:p>
+    <w:p>
+      <w:pPr>
+        <w:spacing w:after="15"/>
+      </w:pPr>
+      <w:r>
+        <w:rPr>
+          <w:rFonts w:ascii="Calibri" w:cs="Calibri" w:eastAsia="Calibri" w:hAnsi="Calibri"/>
+          <w:b/>
+          <w:bCs/>
+          <w:sz w:val="20"/>
+          <w:szCs w:val="20"/>
+        </w:rPr>
+        <w:t xml:space="preserve">Additional projects: </w:t>
+      </w:r>
+      <w:r>
+        <w:rPr>
+          <w:rFonts w:ascii="Calibri" w:cs="Calibri" w:eastAsia="Calibri" w:hAnsi="Calibri"/>
+          <w:sz w:val="20"/>
+          <w:szCs w:val="20"/>
+        </w:rPr>
+        <w:t xml:space="preserve">Curvature-Constrained Latent Diffusion, PIRGE-CodeGuard (coding-agent safety), TransferGuard (temporal graph ML), ClearDue (agentic finance, LangGraph), QCertRoute (quantum routing), CarbonTwin-R, chaosctl (Bosch hackathon). Code: github.com/Kxvya18</w:t>
+      </w:r>
+    </w:p>
+    <w:p>
+      <w:pPr>
+        <w:pBdr>
+          <w:bottom w:val="single" w:color="000000" w:sz="6" w:space="1"/>
+        </w:pBdr>
+        <w:spacing w:after="45" w:before="110"/>
+      </w:pPr>
+      <w:r>
+        <w:rPr>
+          <w:rFonts w:ascii="Calibri" w:cs="Calibri" w:eastAsia="Calibri" w:hAnsi="Calibri"/>
+          <w:b/>
+          <w:bCs/>
+          <w:sz w:val="22"/>
+          <w:szCs w:val="22"/>
+        </w:rPr>
+        <w:t xml:space="preserve">PUBLICATIONS</w:t>
       </w:r>
     </w:p>
     <w:p>
@@ -614,6 +625,24 @@
           <w:sz w:val="20"/>
           <w:szCs w:val="20"/>
         </w:rPr>
+        <w:t xml:space="preserve">K. Kalavala, A. Pandey, S. Priya, "MOGA-FCM: Unsupervised Cognitive Load Detection via Multi-Objective Genetic Algorithms and Bayesian Fuzzy C-Means in ADAS," 2nd Congress on Intelligent Machines and Algorithms (CIMA 2026), NIT Puducherry.</w:t>
+      </w:r>
+    </w:p>
+    <w:p>
+      <w:pPr>
+        <w:pStyle w:val="ListParagraph"/>
+        <w:numPr>
+          <w:ilvl w:val="0"/>
+          <w:numId w:val="2"/>
+        </w:numPr>
+        <w:spacing w:after="15"/>
+      </w:pPr>
+      <w:r>
+        <w:rPr>
+          <w:rFonts w:ascii="Calibri" w:cs="Calibri" w:eastAsia="Calibri" w:hAnsi="Calibri"/>
+          <w:sz w:val="20"/>
+          <w:szCs w:val="20"/>
+        </w:rPr>
         <w:t xml:space="preserve">Manuscripts in preparation: Curvature-Audited Boltzmann Evidence for Source Localization in Evolving Networks; Shot-Adaptive Quantum Expert Routing with Certified Top-Ten Decisions.</w:t>
       </w:r>
     </w:p>
@@ -676,19 +705,6 @@
     </w:p>
     <w:p>
       <w:pPr>
-        <w:spacing w:after="15"/>
-      </w:pPr>
-      <w:r>
-        <w:rPr>
-          <w:rFonts w:ascii="Calibri" w:cs="Calibri" w:eastAsia="Calibri" w:hAnsi="Calibri"/>
-          <w:sz w:val="20"/>
-          <w:szCs w:val="20"/>
-        </w:rPr>
-        <w:t xml:space="preserve">Pre-University, Science, Deeksha Centre for Learning (96%)  |  Secondary, Apollo National Public School (96%)</w:t>
-      </w:r>
-    </w:p>
-    <w:p>
-      <w:pPr>
         <w:pBdr>
           <w:bottom w:val="single" w:color="000000" w:sz="6" w:space="1"/>
         </w:pBdr>
@@ -720,7 +736,7 @@
     </w:p>
     <w:sectPr>
       <w:pgSz w:w="11906" w:h="16838" w:orient="portrait"/>
-      <w:pgMar w:top="540" w:right="570" w:bottom="540" w:left="570" w:header="708" w:footer="708" w:gutter="0"/>
+      <w:pgMar w:top="500" w:right="570" w:bottom="480" w:left="570" w:header="708" w:footer="708" w:gutter="0"/>
       <w:pgNumType/>
       <w:docGrid w:linePitch="360"/>
     </w:sectPr>

</xml_diff>

<commit_message>
CensusAI listed as a project; updated resume
</commit_message>
<xml_diff>
--- a/public/Kavya_Kalavala_Resume.docx
+++ b/public/Kavya_Kalavala_Resume.docx
@@ -92,39 +92,133 @@
           <w:sz w:val="22"/>
           <w:szCs w:val="22"/>
         </w:rPr>
-        <w:t xml:space="preserve">EXPERIENCE</w:t>
-      </w:r>
-    </w:p>
-    <w:p>
-      <w:pPr>
-        <w:tabs>
-          <w:tab w:val="right" w:pos="10760"/>
-        </w:tabs>
-        <w:spacing w:after="15" w:before="40"/>
-      </w:pPr>
-      <w:r>
-        <w:rPr>
-          <w:rFonts w:ascii="Calibri" w:cs="Calibri" w:eastAsia="Calibri" w:hAnsi="Calibri"/>
-          <w:b/>
-          <w:bCs/>
-          <w:sz w:val="20"/>
-          <w:szCs w:val="20"/>
-        </w:rPr>
-        <w:t xml:space="preserve">Data Pipeline Engineer (Remote), CensusAI, Australia</w:t>
-      </w:r>
-      <w:r>
-        <w:rPr>
-          <w:rFonts w:ascii="Calibri" w:cs="Calibri" w:eastAsia="Calibri" w:hAnsi="Calibri"/>
-          <w:sz w:val="20"/>
-          <w:szCs w:val="20"/>
-        </w:rPr>
-        <w:t xml:space="preserve">	Sep 2026 - Oct 2026</w:t>
-      </w:r>
-    </w:p>
-    <w:p>
-      <w:pPr>
-        <w:spacing w:after="15"/>
-      </w:pPr>
+        <w:t xml:space="preserve">TECHNICAL SKILLS</w:t>
+      </w:r>
+    </w:p>
+    <w:p>
+      <w:pPr>
+        <w:spacing w:after="15"/>
+      </w:pPr>
+      <w:r>
+        <w:rPr>
+          <w:rFonts w:ascii="Calibri" w:cs="Calibri" w:eastAsia="Calibri" w:hAnsi="Calibri"/>
+          <w:b/>
+          <w:bCs/>
+          <w:sz w:val="20"/>
+          <w:szCs w:val="20"/>
+        </w:rPr>
+        <w:t xml:space="preserve">Languages: </w:t>
+      </w:r>
+      <w:r>
+        <w:rPr>
+          <w:rFonts w:ascii="Calibri" w:cs="Calibri" w:eastAsia="Calibri" w:hAnsi="Calibri"/>
+          <w:sz w:val="20"/>
+          <w:szCs w:val="20"/>
+        </w:rPr>
+        <w:t xml:space="preserve">Python, C++, C, Java, SQL, TypeScript</w:t>
+      </w:r>
+    </w:p>
+    <w:p>
+      <w:pPr>
+        <w:spacing w:after="15"/>
+      </w:pPr>
+      <w:r>
+        <w:rPr>
+          <w:rFonts w:ascii="Calibri" w:cs="Calibri" w:eastAsia="Calibri" w:hAnsi="Calibri"/>
+          <w:b/>
+          <w:bCs/>
+          <w:sz w:val="20"/>
+          <w:szCs w:val="20"/>
+        </w:rPr>
+        <w:t xml:space="preserve">Machine Learning: </w:t>
+      </w:r>
+      <w:r>
+        <w:rPr>
+          <w:rFonts w:ascii="Calibri" w:cs="Calibri" w:eastAsia="Calibri" w:hAnsi="Calibri"/>
+          <w:sz w:val="20"/>
+          <w:szCs w:val="20"/>
+        </w:rPr>
+        <w:t xml:space="preserve">PyTorch, scikit-learn, XGBoost, LightGBM, PyTorch Geometric, GNNs, diffusion models, time-series forecasting, conformal prediction, causal inference, Bayesian optimization</w:t>
+      </w:r>
+    </w:p>
+    <w:p>
+      <w:pPr>
+        <w:spacing w:after="15"/>
+      </w:pPr>
+      <w:r>
+        <w:rPr>
+          <w:rFonts w:ascii="Calibri" w:cs="Calibri" w:eastAsia="Calibri" w:hAnsi="Calibri"/>
+          <w:b/>
+          <w:bCs/>
+          <w:sz w:val="20"/>
+          <w:szCs w:val="20"/>
+        </w:rPr>
+        <w:t xml:space="preserve">MLOps and Data: </w:t>
+      </w:r>
+      <w:r>
+        <w:rPr>
+          <w:rFonts w:ascii="Calibri" w:cs="Calibri" w:eastAsia="Calibri" w:hAnsi="Calibri"/>
+          <w:sz w:val="20"/>
+          <w:szCs w:val="20"/>
+        </w:rPr>
+        <w:t xml:space="preserve">MLflow, DVC, Prefect, Evidently, FastAPI, Docker, GitHub Actions, DuckDB, Polars, PostgreSQL, Azure AI Search</w:t>
+      </w:r>
+    </w:p>
+    <w:p>
+      <w:pPr>
+        <w:spacing w:after="15"/>
+      </w:pPr>
+      <w:r>
+        <w:rPr>
+          <w:rFonts w:ascii="Calibri" w:cs="Calibri" w:eastAsia="Calibri" w:hAnsi="Calibri"/>
+          <w:b/>
+          <w:bCs/>
+          <w:sz w:val="20"/>
+          <w:szCs w:val="20"/>
+        </w:rPr>
+        <w:t xml:space="preserve">LLMs and Agents: </w:t>
+      </w:r>
+      <w:r>
+        <w:rPr>
+          <w:rFonts w:ascii="Calibri" w:cs="Calibri" w:eastAsia="Calibri" w:hAnsi="Calibri"/>
+          <w:sz w:val="20"/>
+          <w:szCs w:val="20"/>
+        </w:rPr>
+        <w:t xml:space="preserve">RAG, LangGraph, vector search (pgvector), local LLMs (Qwen, Gemma), retrieval and groundedness evaluation</w:t>
+      </w:r>
+    </w:p>
+    <w:p>
+      <w:pPr>
+        <w:pBdr>
+          <w:bottom w:val="single" w:color="000000" w:sz="6" w:space="1"/>
+        </w:pBdr>
+        <w:spacing w:after="45" w:before="110"/>
+      </w:pPr>
+      <w:r>
+        <w:rPr>
+          <w:rFonts w:ascii="Calibri" w:cs="Calibri" w:eastAsia="Calibri" w:hAnsi="Calibri"/>
+          <w:b/>
+          <w:bCs/>
+          <w:sz w:val="22"/>
+          <w:szCs w:val="22"/>
+        </w:rPr>
+        <w:t xml:space="preserve">PROJECTS</w:t>
+      </w:r>
+    </w:p>
+    <w:p>
+      <w:pPr>
+        <w:spacing w:after="15" w:before="55"/>
+      </w:pPr>
+      <w:r>
+        <w:rPr>
+          <w:rFonts w:ascii="Calibri" w:cs="Calibri" w:eastAsia="Calibri" w:hAnsi="Calibri"/>
+          <w:b/>
+          <w:bCs/>
+          <w:sz w:val="20"/>
+          <w:szCs w:val="20"/>
+        </w:rPr>
+        <w:t xml:space="preserve">PalletCast: End-to-End MLOps for Warehouse Pallet Forecasting</w:t>
+      </w:r>
       <w:r>
         <w:rPr>
           <w:rFonts w:ascii="Calibri" w:cs="Calibri" w:eastAsia="Calibri" w:hAnsi="Calibri"/>
@@ -133,7 +227,7 @@
           <w:sz w:val="20"/>
           <w:szCs w:val="20"/>
         </w:rPr>
-        <w:t xml:space="preserve">Python, DuckDB, Polars, PyArrow, Parquet, SQL</w:t>
+        <w:t xml:space="preserve">  |  Python, LightGBM, MLflow, Prefect, FastAPI, Docker, Evidently</w:t>
       </w:r>
     </w:p>
     <w:p>
@@ -151,7 +245,7 @@
           <w:sz w:val="20"/>
           <w:szCs w:val="20"/>
         </w:rPr>
-        <w:t xml:space="preserve">Optimised the data pipeline of an Australian Bureau of Statistics census platform (2011-2021 DataPacks) that builds a 2.03-billion-row analytical database from Parquet layers.</w:t>
+        <w:t xml:space="preserve">Built a 14-day outbound-pallet forecasting system for an automated cold-storage operator across all nine MLOps stages: validated data with quarantine (pandera, DVC), point-in-time features, model registry with a promotion gate, monthly orchestration, a FastAPI service in Docker, monitoring and CI/CD.</w:t>
       </w:r>
     </w:p>
     <w:p>
@@ -169,135 +263,7 @@
           <w:sz w:val="20"/>
           <w:szCs w:val="20"/>
         </w:rPr>
-        <w:t xml:space="preserve">Redesigned the artifact build to transform Bronze Parquet directly inside DuckDB instead of writing an intermediate Silver copy, cutting build time from 2,974 s to 2,043 s (31% faster) at 4.5 GB peak memory, and removed a full rescan of the fact table.</w:t>
-      </w:r>
-    </w:p>
-    <w:p>
-      <w:pPr>
-        <w:pBdr>
-          <w:bottom w:val="single" w:color="000000" w:sz="6" w:space="1"/>
-        </w:pBdr>
-        <w:spacing w:after="45" w:before="110"/>
-      </w:pPr>
-      <w:r>
-        <w:rPr>
-          <w:rFonts w:ascii="Calibri" w:cs="Calibri" w:eastAsia="Calibri" w:hAnsi="Calibri"/>
-          <w:b/>
-          <w:bCs/>
-          <w:sz w:val="22"/>
-          <w:szCs w:val="22"/>
-        </w:rPr>
-        <w:t xml:space="preserve">TECHNICAL SKILLS</w:t>
-      </w:r>
-    </w:p>
-    <w:p>
-      <w:pPr>
-        <w:spacing w:after="15"/>
-      </w:pPr>
-      <w:r>
-        <w:rPr>
-          <w:rFonts w:ascii="Calibri" w:cs="Calibri" w:eastAsia="Calibri" w:hAnsi="Calibri"/>
-          <w:b/>
-          <w:bCs/>
-          <w:sz w:val="20"/>
-          <w:szCs w:val="20"/>
-        </w:rPr>
-        <w:t xml:space="preserve">Languages: </w:t>
-      </w:r>
-      <w:r>
-        <w:rPr>
-          <w:rFonts w:ascii="Calibri" w:cs="Calibri" w:eastAsia="Calibri" w:hAnsi="Calibri"/>
-          <w:sz w:val="20"/>
-          <w:szCs w:val="20"/>
-        </w:rPr>
-        <w:t xml:space="preserve">Python, C++, C, Java, SQL, TypeScript</w:t>
-      </w:r>
-    </w:p>
-    <w:p>
-      <w:pPr>
-        <w:spacing w:after="15"/>
-      </w:pPr>
-      <w:r>
-        <w:rPr>
-          <w:rFonts w:ascii="Calibri" w:cs="Calibri" w:eastAsia="Calibri" w:hAnsi="Calibri"/>
-          <w:b/>
-          <w:bCs/>
-          <w:sz w:val="20"/>
-          <w:szCs w:val="20"/>
-        </w:rPr>
-        <w:t xml:space="preserve">Machine Learning: </w:t>
-      </w:r>
-      <w:r>
-        <w:rPr>
-          <w:rFonts w:ascii="Calibri" w:cs="Calibri" w:eastAsia="Calibri" w:hAnsi="Calibri"/>
-          <w:sz w:val="20"/>
-          <w:szCs w:val="20"/>
-        </w:rPr>
-        <w:t xml:space="preserve">PyTorch, scikit-learn, XGBoost, LightGBM, PyTorch Geometric, GNNs, diffusion models, time-series forecasting, conformal prediction, causal inference, Bayesian optimization</w:t>
-      </w:r>
-    </w:p>
-    <w:p>
-      <w:pPr>
-        <w:spacing w:after="15"/>
-      </w:pPr>
-      <w:r>
-        <w:rPr>
-          <w:rFonts w:ascii="Calibri" w:cs="Calibri" w:eastAsia="Calibri" w:hAnsi="Calibri"/>
-          <w:b/>
-          <w:bCs/>
-          <w:sz w:val="20"/>
-          <w:szCs w:val="20"/>
-        </w:rPr>
-        <w:t xml:space="preserve">MLOps and Data: </w:t>
-      </w:r>
-      <w:r>
-        <w:rPr>
-          <w:rFonts w:ascii="Calibri" w:cs="Calibri" w:eastAsia="Calibri" w:hAnsi="Calibri"/>
-          <w:sz w:val="20"/>
-          <w:szCs w:val="20"/>
-        </w:rPr>
-        <w:t xml:space="preserve">MLflow, DVC, Prefect, Evidently, FastAPI, Docker, GitHub Actions, DuckDB, Polars, PostgreSQL, Azure AI Search</w:t>
-      </w:r>
-    </w:p>
-    <w:p>
-      <w:pPr>
-        <w:spacing w:after="15"/>
-      </w:pPr>
-      <w:r>
-        <w:rPr>
-          <w:rFonts w:ascii="Calibri" w:cs="Calibri" w:eastAsia="Calibri" w:hAnsi="Calibri"/>
-          <w:b/>
-          <w:bCs/>
-          <w:sz w:val="20"/>
-          <w:szCs w:val="20"/>
-        </w:rPr>
-        <w:t xml:space="preserve">LLMs and Agents: </w:t>
-      </w:r>
-      <w:r>
-        <w:rPr>
-          <w:rFonts w:ascii="Calibri" w:cs="Calibri" w:eastAsia="Calibri" w:hAnsi="Calibri"/>
-          <w:sz w:val="20"/>
-          <w:szCs w:val="20"/>
-        </w:rPr>
-        <w:t xml:space="preserve">RAG, LangGraph, vector search (pgvector), local LLMs (Qwen, Gemma), retrieval and groundedness evaluation</w:t>
-      </w:r>
-    </w:p>
-    <w:p>
-      <w:pPr>
-        <w:pBdr>
-          <w:bottom w:val="single" w:color="000000" w:sz="6" w:space="1"/>
-        </w:pBdr>
-        <w:spacing w:after="45" w:before="110"/>
-      </w:pPr>
-      <w:r>
-        <w:rPr>
-          <w:rFonts w:ascii="Calibri" w:cs="Calibri" w:eastAsia="Calibri" w:hAnsi="Calibri"/>
-          <w:b/>
-          <w:bCs/>
-          <w:sz w:val="22"/>
-          <w:szCs w:val="22"/>
-        </w:rPr>
-        <w:t xml:space="preserve">PROJECTS</w:t>
+        <w:t xml:space="preserve">Ran a fair contest of 17 models in 5 families (baselines, statistical, gradient boosting, Prophet, neural); the deployed model reached 10.8% WAPE vs 14.6% for the best simple rule and held 10.9% on unseen 2026 data.</w:t>
       </w:r>
     </w:p>
     <w:p>
@@ -312,7 +278,7 @@
           <w:sz w:val="20"/>
           <w:szCs w:val="20"/>
         </w:rPr>
-        <w:t xml:space="preserve">PalletCast: End-to-End MLOps for Warehouse Pallet Forecasting</w:t>
+        <w:t xml:space="preserve">CensusAI: Census Data Pipeline Optimisation (Australian data platform)</w:t>
       </w:r>
       <w:r>
         <w:rPr>
@@ -322,7 +288,7 @@
           <w:sz w:val="20"/>
           <w:szCs w:val="20"/>
         </w:rPr>
-        <w:t xml:space="preserve">  |  Python, LightGBM, MLflow, Prefect, FastAPI, Docker, Evidently</w:t>
+        <w:t xml:space="preserve">  |  Python, DuckDB, Polars, PyArrow, Parquet, SQL</w:t>
       </w:r>
     </w:p>
     <w:p>
@@ -340,7 +306,7 @@
           <w:sz w:val="20"/>
           <w:szCs w:val="20"/>
         </w:rPr>
-        <w:t xml:space="preserve">Built a 14-day outbound-pallet forecasting system for an automated cold-storage operator across all nine MLOps stages: validated data with quarantine (pandera, DVC), point-in-time features, model registry with a promotion gate, monthly orchestration, a FastAPI service in Docker, monitoring and CI/CD.</w:t>
+        <w:t xml:space="preserve">Optimised the data pipeline of an Australian Bureau of Statistics census platform (2011-2021 DataPacks) that builds a 2.03-billion-row analytical database from Parquet layers, working remotely with the project's maintainer.</w:t>
       </w:r>
     </w:p>
     <w:p>
@@ -358,7 +324,7 @@
           <w:sz w:val="20"/>
           <w:szCs w:val="20"/>
         </w:rPr>
-        <w:t xml:space="preserve">Ran a fair contest of 17 models in 5 families (baselines, statistical, gradient boosting, Prophet, neural); the deployed model reached 10.8% WAPE vs 14.6% for the best simple rule and held 10.9% on unseen 2026 data.</w:t>
+        <w:t xml:space="preserve">Redesigned the build to transform Bronze Parquet directly inside DuckDB instead of writing an intermediate Silver copy, cutting build time from 2,974 s to 2,043 s (31% faster) at 4.5 GB peak memory and removing a full rescan of the fact table.</w:t>
       </w:r>
     </w:p>
     <w:p>

</xml_diff>

<commit_message>
Evidence gallery: real GitHub snapshots (CI runs, results tables, audits); corner 3D graph back on desktops
</commit_message>
<xml_diff>
--- a/public/Kavya_Kalavala_Resume.docx
+++ b/public/Kavya_Kalavala_Resume.docx
@@ -20,20 +20,6 @@
     </w:p>
     <w:p>
       <w:pPr>
-        <w:spacing w:after="20"/>
-        <w:jc w:val="center"/>
-      </w:pPr>
-      <w:r>
-        <w:rPr>
-          <w:rFonts w:ascii="Calibri" w:cs="Calibri" w:eastAsia="Calibri" w:hAnsi="Calibri"/>
-          <w:sz w:val="20"/>
-          <w:szCs w:val="20"/>
-        </w:rPr>
-        <w:t xml:space="preserve">Bengaluru, India  |  +91-9535832089  |  kxvya1820@gmail.com</w:t>
-      </w:r>
-    </w:p>
-    <w:p>
-      <w:pPr>
         <w:spacing w:after="50"/>
         <w:jc w:val="center"/>
       </w:pPr>
@@ -43,8 +29,80 @@
           <w:sz w:val="20"/>
           <w:szCs w:val="20"/>
         </w:rPr>
-        <w:t xml:space="preserve">linkedin.com/in/kavya-kalavala-6008b5286  |  github.com/Kxvya18  |  kavya-portfolio-webpage.vercel.app</w:t>
-      </w:r>
+        <w:t xml:space="preserve">Bengaluru, India  |  +91-9535832089  |  </w:t>
+      </w:r>
+      <w:hyperlink w:history="1" r:id="rIdszwyen5e_gbivfl7jbazj">
+        <w:r>
+          <w:rPr>
+            <w:rFonts w:ascii="Calibri" w:cs="Calibri" w:eastAsia="Calibri" w:hAnsi="Calibri"/>
+            <w:color w:val="1F4E9A"/>
+            <w:sz w:val="20"/>
+            <w:szCs w:val="20"/>
+            <w:u w:val="single"/>
+          </w:rPr>
+          <w:t xml:space="preserve">kxvya1820@gmail.com</w:t>
+        </w:r>
+      </w:hyperlink>
+      <w:r>
+        <w:rPr>
+          <w:rFonts w:ascii="Calibri" w:cs="Calibri" w:eastAsia="Calibri" w:hAnsi="Calibri"/>
+          <w:sz w:val="20"/>
+          <w:szCs w:val="20"/>
+        </w:rPr>
+        <w:t xml:space="preserve">  |  </w:t>
+      </w:r>
+      <w:hyperlink w:history="1" r:id="rIdel0pdq_amtgeuc-aqdzdg">
+        <w:r>
+          <w:rPr>
+            <w:rFonts w:ascii="Calibri" w:cs="Calibri" w:eastAsia="Calibri" w:hAnsi="Calibri"/>
+            <w:color w:val="1F4E9A"/>
+            <w:sz w:val="20"/>
+            <w:szCs w:val="20"/>
+            <w:u w:val="single"/>
+          </w:rPr>
+          <w:t xml:space="preserve">LinkedIn</w:t>
+        </w:r>
+      </w:hyperlink>
+      <w:r>
+        <w:rPr>
+          <w:rFonts w:ascii="Calibri" w:cs="Calibri" w:eastAsia="Calibri" w:hAnsi="Calibri"/>
+          <w:sz w:val="20"/>
+          <w:szCs w:val="20"/>
+        </w:rPr>
+        <w:t xml:space="preserve">  |  </w:t>
+      </w:r>
+      <w:hyperlink w:history="1" r:id="rId1zhdgqv3moh9amlainwfu">
+        <w:r>
+          <w:rPr>
+            <w:rFonts w:ascii="Calibri" w:cs="Calibri" w:eastAsia="Calibri" w:hAnsi="Calibri"/>
+            <w:color w:val="1F4E9A"/>
+            <w:sz w:val="20"/>
+            <w:szCs w:val="20"/>
+            <w:u w:val="single"/>
+          </w:rPr>
+          <w:t xml:space="preserve">GitHub</w:t>
+        </w:r>
+      </w:hyperlink>
+      <w:r>
+        <w:rPr>
+          <w:rFonts w:ascii="Calibri" w:cs="Calibri" w:eastAsia="Calibri" w:hAnsi="Calibri"/>
+          <w:sz w:val="20"/>
+          <w:szCs w:val="20"/>
+        </w:rPr>
+        <w:t xml:space="preserve">  |  </w:t>
+      </w:r>
+      <w:hyperlink w:history="1" r:id="rIdiarvqcn3u6l_xhaxqpuge">
+        <w:r>
+          <w:rPr>
+            <w:rFonts w:ascii="Calibri" w:cs="Calibri" w:eastAsia="Calibri" w:hAnsi="Calibri"/>
+            <w:color w:val="1F4E9A"/>
+            <w:sz w:val="20"/>
+            <w:szCs w:val="20"/>
+            <w:u w:val="single"/>
+          </w:rPr>
+          <w:t xml:space="preserve">Portfolio</w:t>
+        </w:r>
+      </w:hyperlink>
     </w:p>
     <w:p>
       <w:pPr>

</xml_diff>

<commit_message>
Label PalletCast data as simulated in downloadable resume
Co-Authored-By: Claude Opus 5.5 <noreply@anthropic.com>
</commit_message>
<xml_diff>
--- a/public/Kavya_Kalavala_Resume.docx
+++ b/public/Kavya_Kalavala_Resume.docx
@@ -31,7 +31,7 @@
         </w:rPr>
         <w:t xml:space="preserve">Bengaluru, India  |  +91-9535832089  |  </w:t>
       </w:r>
-      <w:hyperlink w:history="1" r:id="rIdszwyen5e_gbivfl7jbazj">
+      <w:hyperlink w:history="1" r:id="rIdm7ghy1xpqpyqwnll3m6vn">
         <w:r>
           <w:rPr>
             <w:rFonts w:ascii="Calibri" w:cs="Calibri" w:eastAsia="Calibri" w:hAnsi="Calibri"/>
@@ -51,7 +51,7 @@
         </w:rPr>
         <w:t xml:space="preserve">  |  </w:t>
       </w:r>
-      <w:hyperlink w:history="1" r:id="rIdel0pdq_amtgeuc-aqdzdg">
+      <w:hyperlink w:history="1" r:id="rIdb9rc79b3pjtx-k2p2jwag">
         <w:r>
           <w:rPr>
             <w:rFonts w:ascii="Calibri" w:cs="Calibri" w:eastAsia="Calibri" w:hAnsi="Calibri"/>
@@ -71,7 +71,7 @@
         </w:rPr>
         <w:t xml:space="preserve">  |  </w:t>
       </w:r>
-      <w:hyperlink w:history="1" r:id="rId1zhdgqv3moh9amlainwfu">
+      <w:hyperlink w:history="1" r:id="rIdakskpyhljoxlauoh52dr3">
         <w:r>
           <w:rPr>
             <w:rFonts w:ascii="Calibri" w:cs="Calibri" w:eastAsia="Calibri" w:hAnsi="Calibri"/>
@@ -91,7 +91,7 @@
         </w:rPr>
         <w:t xml:space="preserve">  |  </w:t>
       </w:r>
-      <w:hyperlink w:history="1" r:id="rIdiarvqcn3u6l_xhaxqpuge">
+      <w:hyperlink w:history="1" r:id="rIdgvfllgozatjkexcsb3epq">
         <w:r>
           <w:rPr>
             <w:rFonts w:ascii="Calibri" w:cs="Calibri" w:eastAsia="Calibri" w:hAnsi="Calibri"/>
@@ -321,7 +321,7 @@
           <w:sz w:val="20"/>
           <w:szCs w:val="20"/>
         </w:rPr>
-        <w:t xml:space="preserve">Ran a fair contest of 17 models in 5 families (baselines, statistical, gradient boosting, Prophet, neural); the deployed model reached 10.8% WAPE vs 14.6% for the best simple rule and held 10.9% on unseen 2026 data.</w:t>
+        <w:t xml:space="preserve">Ran a fair contest of 17 models in 5 families (baselines, statistical, gradient boosting, Prophet, neural); the deployed model reached 10.8% WAPE vs 14.6% for the best simple rule and held 10.9% on a held-out year.</w:t>
       </w:r>
     </w:p>
     <w:p>

</xml_diff>

<commit_message>
Label PalletCast as simulated in general resume
Co-Authored-By: Claude Opus 5.5 <noreply@anthropic.com>
</commit_message>
<xml_diff>
--- a/public/Kavya_Kalavala_Resume.docx
+++ b/public/Kavya_Kalavala_Resume.docx
@@ -31,7 +31,7 @@
         </w:rPr>
         <w:t xml:space="preserve">Bengaluru, India  |  +91-9535832089  |  </w:t>
       </w:r>
-      <w:hyperlink w:history="1" r:id="rIdm7ghy1xpqpyqwnll3m6vn">
+      <w:hyperlink w:history="1" r:id="rIdeetq9blvd5iut2rr2g-n1">
         <w:r>
           <w:rPr>
             <w:rFonts w:ascii="Calibri" w:cs="Calibri" w:eastAsia="Calibri" w:hAnsi="Calibri"/>
@@ -51,7 +51,7 @@
         </w:rPr>
         <w:t xml:space="preserve">  |  </w:t>
       </w:r>
-      <w:hyperlink w:history="1" r:id="rIdb9rc79b3pjtx-k2p2jwag">
+      <w:hyperlink w:history="1" r:id="rIdsj0evfjziywhdzif1bobu">
         <w:r>
           <w:rPr>
             <w:rFonts w:ascii="Calibri" w:cs="Calibri" w:eastAsia="Calibri" w:hAnsi="Calibri"/>
@@ -71,7 +71,7 @@
         </w:rPr>
         <w:t xml:space="preserve">  |  </w:t>
       </w:r>
-      <w:hyperlink w:history="1" r:id="rIdakskpyhljoxlauoh52dr3">
+      <w:hyperlink w:history="1" r:id="rId8fnea7od7dzmuzn11obab">
         <w:r>
           <w:rPr>
             <w:rFonts w:ascii="Calibri" w:cs="Calibri" w:eastAsia="Calibri" w:hAnsi="Calibri"/>
@@ -91,7 +91,7 @@
         </w:rPr>
         <w:t xml:space="preserve">  |  </w:t>
       </w:r>
-      <w:hyperlink w:history="1" r:id="rIdgvfllgozatjkexcsb3epq">
+      <w:hyperlink w:history="1" r:id="rIdlojpknp9lc5ahupgusbs2">
         <w:r>
           <w:rPr>
             <w:rFonts w:ascii="Calibri" w:cs="Calibri" w:eastAsia="Calibri" w:hAnsi="Calibri"/>
@@ -303,7 +303,7 @@
           <w:sz w:val="20"/>
           <w:szCs w:val="20"/>
         </w:rPr>
-        <w:t xml:space="preserve">Built a 14-day outbound-pallet forecasting system for an automated cold-storage operator across all nine MLOps stages: validated data with quarantine (pandera, DVC), point-in-time features, model registry with a promotion gate, monthly orchestration, a FastAPI service in Docker, monitoring and CI/CD.</w:t>
+        <w:t xml:space="preserve">Built a 14-day outbound-pallet forecasting system for a simulated automated cold-storage network across all nine MLOps stages: validated data with quarantine (pandera, DVC), point-in-time features, model registry with a promotion gate, monthly orchestration, a FastAPI service in Docker, monitoring and CI/CD.</w:t>
       </w:r>
     </w:p>
     <w:p>

</xml_diff>

<commit_message>
Remove hackathon name from resume
Co-Authored-By: Claude Opus 5.5 <noreply@anthropic.com>
</commit_message>
<xml_diff>
--- a/public/Kavya_Kalavala_Resume.docx
+++ b/public/Kavya_Kalavala_Resume.docx
@@ -31,7 +31,7 @@
         </w:rPr>
         <w:t xml:space="preserve">Bengaluru, India  |  +91-9535832089  |  </w:t>
       </w:r>
-      <w:hyperlink w:history="1" r:id="rIdeetq9blvd5iut2rr2g-n1">
+      <w:hyperlink w:history="1" r:id="rId7tn6oederv2pjeen2rxlf">
         <w:r>
           <w:rPr>
             <w:rFonts w:ascii="Calibri" w:cs="Calibri" w:eastAsia="Calibri" w:hAnsi="Calibri"/>
@@ -51,7 +51,7 @@
         </w:rPr>
         <w:t xml:space="preserve">  |  </w:t>
       </w:r>
-      <w:hyperlink w:history="1" r:id="rIdsj0evfjziywhdzif1bobu">
+      <w:hyperlink w:history="1" r:id="rIdwnp2wpxfpvgnv98r9h2x3">
         <w:r>
           <w:rPr>
             <w:rFonts w:ascii="Calibri" w:cs="Calibri" w:eastAsia="Calibri" w:hAnsi="Calibri"/>
@@ -71,7 +71,7 @@
         </w:rPr>
         <w:t xml:space="preserve">  |  </w:t>
       </w:r>
-      <w:hyperlink w:history="1" r:id="rId8fnea7od7dzmuzn11obab">
+      <w:hyperlink w:history="1" r:id="rIdsx-jsbevr7drqreavq91d">
         <w:r>
           <w:rPr>
             <w:rFonts w:ascii="Calibri" w:cs="Calibri" w:eastAsia="Calibri" w:hAnsi="Calibri"/>
@@ -91,7 +91,7 @@
         </w:rPr>
         <w:t xml:space="preserve">  |  </w:t>
       </w:r>
-      <w:hyperlink w:history="1" r:id="rIdlojpknp9lc5ahupgusbs2">
+      <w:hyperlink w:history="1" r:id="rIdfr_t-rutv3mkj3rkx1w9s">
         <w:r>
           <w:rPr>
             <w:rFonts w:ascii="Calibri" w:cs="Calibri" w:eastAsia="Calibri" w:hAnsi="Calibri"/>
@@ -613,7 +613,7 @@
           <w:sz w:val="20"/>
           <w:szCs w:val="20"/>
         </w:rPr>
-        <w:t xml:space="preserve">Curvature-Constrained Latent Diffusion, PIRGE-CodeGuard (coding-agent safety), TransferGuard (temporal graph ML), ClearDue (agentic finance, LangGraph), QCertRoute (quantum routing), CarbonTwin-R, chaosctl (Bosch hackathon). Code: github.com/Kxvya18</w:t>
+        <w:t xml:space="preserve">Curvature-Constrained Latent Diffusion, PIRGE-CodeGuard (coding-agent safety), TransferGuard (temporal graph ML), ClearDue (agentic finance, LangGraph), QCertRoute (quantum routing), CarbonTwin-R, chaosctl (agentic chaos engineering). Code: github.com/Kxvya18</w:t>
       </w:r>
     </w:p>
     <w:p>

</xml_diff>